<commit_message>
feat: implementar panel de diagnostico de errores y estandarizacion gxp
</commit_message>
<xml_diff>
--- a/plantilla/Generación de FPP 1 - 4_  Plantilla valores.docx
+++ b/plantilla/Generación de FPP 1 - 4_  Plantilla valores.docx
@@ -193,15 +193,6 @@
             <w:vAlign w:val="center"/>
           </w:tcPr>
           <w:p>
-            <w:pPr>
-              <w:shd w:val="clear" w:color="auto" w:fill="F8F9FA"/>
-              <w:spacing w:line="324" w:lineRule="auto"/>
-              <w:jc w:val="both"/>
-              <w:rPr>
-                <w:sz w:val="20"/>
-                <w:szCs w:val="20"/>
-              </w:rPr>
-            </w:pPr>
             <w:r>
               <w:rPr>
                 <w:sz w:val="20"/>
@@ -209,21 +200,19 @@
               </w:rPr>
               <w:t>{{</w:t>
             </w:r>
-            <w:proofErr w:type="spellStart"/>
-            <w:r>
-              <w:rPr>
-                <w:sz w:val="20"/>
-                <w:szCs w:val="20"/>
-              </w:rPr>
-              <w:t>Codigo</w:t>
-            </w:r>
-            <w:proofErr w:type="spellEnd"/>
-            <w:r>
-              <w:rPr>
-                <w:sz w:val="20"/>
-                <w:szCs w:val="20"/>
-              </w:rPr>
-              <w:t>}}</w:t>
+            <w:r>
+              <w:rPr>
+                <w:sz w:val="20"/>
+                <w:szCs w:val="20"/>
+              </w:rPr>
+              <w:t>c</w:t>
+            </w:r>
+            <w:r>
+              <w:rPr>
+                <w:sz w:val="20"/>
+                <w:szCs w:val="20"/>
+              </w:rPr>
+              <w:t>odigo}}</w:t>
             </w:r>
           </w:p>
         </w:tc>
@@ -260,14 +249,6 @@
             <w:vAlign w:val="center"/>
           </w:tcPr>
           <w:p>
-            <w:pPr>
-              <w:spacing w:line="240" w:lineRule="auto"/>
-              <w:jc w:val="both"/>
-              <w:rPr>
-                <w:sz w:val="20"/>
-                <w:szCs w:val="20"/>
-              </w:rPr>
-            </w:pPr>
             <w:r>
               <w:rPr>
                 <w:sz w:val="20"/>
@@ -275,21 +256,19 @@
               </w:rPr>
               <w:t>{{</w:t>
             </w:r>
-            <w:proofErr w:type="spellStart"/>
-            <w:r>
-              <w:rPr>
-                <w:sz w:val="20"/>
-                <w:szCs w:val="20"/>
-              </w:rPr>
-              <w:t>Version</w:t>
-            </w:r>
-            <w:proofErr w:type="spellEnd"/>
-            <w:r>
-              <w:rPr>
-                <w:sz w:val="20"/>
-                <w:szCs w:val="20"/>
-              </w:rPr>
-              <w:t>}}</w:t>
+            <w:r>
+              <w:rPr>
+                <w:sz w:val="20"/>
+                <w:szCs w:val="20"/>
+              </w:rPr>
+              <w:t>v</w:t>
+            </w:r>
+            <w:r>
+              <w:rPr>
+                <w:sz w:val="20"/>
+                <w:szCs w:val="20"/>
+              </w:rPr>
+              <w:t>ersion}}</w:t>
             </w:r>
           </w:p>
         </w:tc>
@@ -341,8 +320,6 @@
           </w:tcPr>
           <w:p>
             <w:pPr>
-              <w:spacing w:line="240" w:lineRule="auto"/>
-              <w:jc w:val="both"/>
               <w:rPr>
                 <w:sz w:val="20"/>
                 <w:szCs w:val="20"/>
@@ -355,15 +332,13 @@
               </w:rPr>
               <w:t>{{</w:t>
             </w:r>
-            <w:proofErr w:type="spellStart"/>
-            <w:r>
-              <w:rPr>
-                <w:sz w:val="20"/>
-                <w:szCs w:val="20"/>
-              </w:rPr>
-              <w:t>Tipo_de_Proceso</w:t>
-            </w:r>
-            <w:proofErr w:type="spellEnd"/>
+            <w:r>
+              <w:rPr>
+                <w:sz w:val="20"/>
+                <w:szCs w:val="20"/>
+              </w:rPr>
+              <w:t>tipoProceso</w:t>
+            </w:r>
             <w:r>
               <w:rPr>
                 <w:sz w:val="20"/>
@@ -414,23 +389,31 @@
           </w:tcPr>
           <w:p>
             <w:pPr>
-              <w:spacing w:line="240" w:lineRule="auto"/>
-              <w:jc w:val="both"/>
-              <w:rPr>
-                <w:b/>
-                <w:bCs/>
-                <w:sz w:val="20"/>
-                <w:szCs w:val="20"/>
-              </w:rPr>
-            </w:pPr>
-            <w:r>
-              <w:rPr>
-                <w:b/>
-                <w:bCs/>
-                <w:sz w:val="20"/>
-                <w:szCs w:val="20"/>
-              </w:rPr>
-              <w:t>{{Nombre}}</w:t>
+              <w:rPr>
+                <w:sz w:val="20"/>
+                <w:szCs w:val="20"/>
+              </w:rPr>
+            </w:pPr>
+            <w:r>
+              <w:rPr>
+                <w:sz w:val="20"/>
+                <w:szCs w:val="20"/>
+              </w:rPr>
+              <w:t>{{</w:t>
+            </w:r>
+            <w:r>
+              <w:rPr>
+                <w:sz w:val="20"/>
+                <w:szCs w:val="20"/>
+              </w:rPr>
+              <w:t>n</w:t>
+            </w:r>
+            <w:r>
+              <w:rPr>
+                <w:sz w:val="20"/>
+                <w:szCs w:val="20"/>
+              </w:rPr>
+              <w:t>ombre}}</w:t>
             </w:r>
           </w:p>
         </w:tc>
@@ -482,7 +465,6 @@
           </w:tcPr>
           <w:p>
             <w:pPr>
-              <w:spacing w:line="240" w:lineRule="auto"/>
               <w:rPr>
                 <w:sz w:val="20"/>
                 <w:szCs w:val="20"/>
@@ -495,21 +477,33 @@
               </w:rPr>
               <w:t>{{</w:t>
             </w:r>
-            <w:proofErr w:type="spellStart"/>
-            <w:r>
-              <w:rPr>
-                <w:sz w:val="20"/>
-                <w:szCs w:val="20"/>
-              </w:rPr>
-              <w:t>Dueno_del_proceso</w:t>
-            </w:r>
-            <w:proofErr w:type="spellEnd"/>
-            <w:r>
-              <w:rPr>
-                <w:sz w:val="20"/>
-                <w:szCs w:val="20"/>
-              </w:rPr>
-              <w:t>}}</w:t>
+            <w:r>
+              <w:rPr>
+                <w:sz w:val="20"/>
+                <w:szCs w:val="20"/>
+              </w:rPr>
+              <w:t>d</w:t>
+            </w:r>
+            <w:r>
+              <w:rPr>
+                <w:sz w:val="20"/>
+                <w:szCs w:val="20"/>
+              </w:rPr>
+              <w:t>ueno</w:t>
+            </w:r>
+            <w:r>
+              <w:rPr>
+                <w:sz w:val="20"/>
+                <w:szCs w:val="20"/>
+              </w:rPr>
+              <w:t>P</w:t>
+            </w:r>
+            <w:r>
+              <w:rPr>
+                <w:sz w:val="20"/>
+                <w:szCs w:val="20"/>
+              </w:rPr>
+              <w:t>roceso}}</w:t>
             </w:r>
           </w:p>
         </w:tc>
@@ -561,23 +555,45 @@
           </w:tcPr>
           <w:p>
             <w:pPr>
-              <w:spacing w:line="240" w:lineRule="auto"/>
-              <w:jc w:val="both"/>
-              <w:rPr>
-                <w:sz w:val="20"/>
-                <w:szCs w:val="20"/>
-              </w:rPr>
-            </w:pPr>
-            <w:r>
+              <w:rPr>
+                <w:sz w:val="20"/>
+                <w:szCs w:val="20"/>
+              </w:rPr>
+            </w:pPr>
+            <w:r>
+              <w:rPr>
+                <w:sz w:val="20"/>
+                <w:szCs w:val="20"/>
+              </w:rPr>
               <w:t>{{</w:t>
             </w:r>
-            <w:proofErr w:type="spellStart"/>
-            <w:r>
-              <w:t>Objetivo_del_proceso</w:t>
-            </w:r>
-            <w:proofErr w:type="spellEnd"/>
-            <w:r>
-              <w:t>}}</w:t>
+            <w:r>
+              <w:rPr>
+                <w:sz w:val="20"/>
+                <w:szCs w:val="20"/>
+              </w:rPr>
+              <w:t>o</w:t>
+            </w:r>
+            <w:r>
+              <w:rPr>
+                <w:sz w:val="20"/>
+                <w:szCs w:val="20"/>
+              </w:rPr>
+              <w:t>bjetivo</w:t>
+            </w:r>
+            <w:r>
+              <w:rPr>
+                <w:sz w:val="20"/>
+                <w:szCs w:val="20"/>
+              </w:rPr>
+              <w:t>P</w:t>
+            </w:r>
+            <w:r>
+              <w:rPr>
+                <w:sz w:val="20"/>
+                <w:szCs w:val="20"/>
+              </w:rPr>
+              <w:t>roceso}}</w:t>
             </w:r>
           </w:p>
         </w:tc>
@@ -624,17 +640,7 @@
           </w:tcPr>
           <w:p>
             <w:pPr>
-              <w:pBdr>
-                <w:top w:val="nil"/>
-                <w:left w:val="nil"/>
-                <w:bottom w:val="nil"/>
-                <w:right w:val="nil"/>
-                <w:between w:val="nil"/>
-              </w:pBdr>
-              <w:spacing w:line="240" w:lineRule="auto"/>
-              <w:jc w:val="both"/>
-              <w:rPr>
-                <w:color w:val="000000"/>
+              <w:rPr>
                 <w:sz w:val="20"/>
                 <w:szCs w:val="20"/>
               </w:rPr>
@@ -646,13 +652,47 @@
               </w:rPr>
               <w:t>{{</w:t>
             </w:r>
-            <w:proofErr w:type="spellStart"/>
-            <w:r>
-              <w:t>Objetivo_estratégico</w:t>
-            </w:r>
-            <w:proofErr w:type="spellEnd"/>
-            <w:r>
-              <w:t>}}</w:t>
+            <w:r>
+              <w:rPr>
+                <w:sz w:val="20"/>
+                <w:szCs w:val="20"/>
+              </w:rPr>
+              <w:t>o</w:t>
+            </w:r>
+            <w:r>
+              <w:rPr>
+                <w:sz w:val="20"/>
+                <w:szCs w:val="20"/>
+              </w:rPr>
+              <w:t>bjetivo</w:t>
+            </w:r>
+            <w:r>
+              <w:rPr>
+                <w:sz w:val="20"/>
+                <w:szCs w:val="20"/>
+              </w:rPr>
+              <w:t>E</w:t>
+            </w:r>
+            <w:r>
+              <w:rPr>
+                <w:sz w:val="20"/>
+                <w:szCs w:val="20"/>
+              </w:rPr>
+              <w:t>strat</w:t>
+            </w:r>
+            <w:r>
+              <w:rPr>
+                <w:sz w:val="20"/>
+                <w:szCs w:val="20"/>
+              </w:rPr>
+              <w:t>e</w:t>
+            </w:r>
+            <w:r>
+              <w:rPr>
+                <w:sz w:val="20"/>
+                <w:szCs w:val="20"/>
+              </w:rPr>
+              <w:t>gico}}</w:t>
             </w:r>
           </w:p>
         </w:tc>
@@ -698,17 +738,7 @@
           </w:tcPr>
           <w:p>
             <w:pPr>
-              <w:pBdr>
-                <w:top w:val="nil"/>
-                <w:left w:val="nil"/>
-                <w:bottom w:val="nil"/>
-                <w:right w:val="nil"/>
-                <w:between w:val="nil"/>
-              </w:pBdr>
-              <w:spacing w:line="240" w:lineRule="auto"/>
-              <w:jc w:val="both"/>
-              <w:rPr>
-                <w:color w:val="000000"/>
+              <w:rPr>
                 <w:sz w:val="20"/>
                 <w:szCs w:val="20"/>
               </w:rPr>
@@ -720,15 +750,13 @@
               </w:rPr>
               <w:t>{{</w:t>
             </w:r>
-            <w:proofErr w:type="spellStart"/>
-            <w:r>
-              <w:rPr>
-                <w:sz w:val="20"/>
-                <w:szCs w:val="20"/>
-              </w:rPr>
-              <w:t>Requisito_normativo</w:t>
-            </w:r>
-            <w:proofErr w:type="spellEnd"/>
+            <w:r>
+              <w:rPr>
+                <w:sz w:val="20"/>
+                <w:szCs w:val="20"/>
+              </w:rPr>
+              <w:t>requisitosNormativos</w:t>
+            </w:r>
             <w:r>
               <w:rPr>
                 <w:sz w:val="20"/>
@@ -931,9 +959,6 @@
           </w:tcPr>
           <w:p>
             <w:pPr>
-              <w:spacing w:line="240" w:lineRule="auto"/>
-              <w:ind w:left="360"/>
-              <w:jc w:val="both"/>
               <w:rPr>
                 <w:sz w:val="20"/>
                 <w:szCs w:val="20"/>
@@ -946,21 +971,19 @@
               </w:rPr>
               <w:t>{{</w:t>
             </w:r>
-            <w:proofErr w:type="spellStart"/>
-            <w:r>
-              <w:rPr>
-                <w:sz w:val="20"/>
-                <w:szCs w:val="20"/>
-              </w:rPr>
-              <w:t>Proveedor_de_elemento_de_entrada</w:t>
-            </w:r>
-            <w:proofErr w:type="spellEnd"/>
-            <w:r>
-              <w:rPr>
-                <w:sz w:val="20"/>
-                <w:szCs w:val="20"/>
-              </w:rPr>
-              <w:t>}}</w:t>
+            <w:r>
+              <w:rPr>
+                <w:sz w:val="20"/>
+                <w:szCs w:val="20"/>
+              </w:rPr>
+              <w:t>p</w:t>
+            </w:r>
+            <w:r>
+              <w:rPr>
+                <w:sz w:val="20"/>
+                <w:szCs w:val="20"/>
+              </w:rPr>
+              <w:t>roveedor}}</w:t>
             </w:r>
           </w:p>
         </w:tc>
@@ -970,19 +993,30 @@
           </w:tcPr>
           <w:p>
             <w:pPr>
-              <w:spacing w:line="240" w:lineRule="auto"/>
-              <w:ind w:left="360"/>
-              <w:jc w:val="both"/>
-            </w:pPr>
-            <w:r>
-              <w:t>{{</w:t>
-            </w:r>
-            <w:proofErr w:type="spellStart"/>
-            <w:r>
-              <w:t>Elementos_de_entrada</w:t>
-            </w:r>
-            <w:proofErr w:type="spellEnd"/>
-            <w:r>
+              <w:rPr>
+                <w:sz w:val="20"/>
+                <w:szCs w:val="20"/>
+              </w:rPr>
+            </w:pPr>
+            <w:r>
+              <w:rPr>
+                <w:sz w:val="20"/>
+                <w:szCs w:val="20"/>
+              </w:rPr>
+              <w:t>{{entrada</w:t>
+            </w:r>
+            <w:r>
+              <w:rPr>
+                <w:sz w:val="20"/>
+                <w:szCs w:val="20"/>
+              </w:rPr>
+              <w:t>s</w:t>
+            </w:r>
+            <w:r>
+              <w:rPr>
+                <w:sz w:val="20"/>
+                <w:szCs w:val="20"/>
+              </w:rPr>
               <w:t>}}</w:t>
             </w:r>
           </w:p>
@@ -997,20 +1031,38 @@
           </w:tcPr>
           <w:p>
             <w:pPr>
-              <w:spacing w:line="240" w:lineRule="auto"/>
-              <w:ind w:left="360"/>
-              <w:jc w:val="both"/>
-              <w:rPr>
-                <w:sz w:val="20"/>
-                <w:szCs w:val="20"/>
-              </w:rPr>
-            </w:pPr>
-            <w:r>
-              <w:rPr>
-                <w:sz w:val="20"/>
-                <w:szCs w:val="20"/>
-              </w:rPr>
-              <w:t>{{Proceso_desplegado_Nivel_2}}</w:t>
+              <w:rPr>
+                <w:sz w:val="20"/>
+                <w:szCs w:val="20"/>
+              </w:rPr>
+            </w:pPr>
+            <w:r>
+              <w:rPr>
+                <w:sz w:val="20"/>
+                <w:szCs w:val="20"/>
+              </w:rPr>
+              <w:t>{{</w:t>
+            </w:r>
+            <w:r>
+              <w:rPr>
+                <w:sz w:val="20"/>
+                <w:szCs w:val="20"/>
+              </w:rPr>
+              <w:t>sub</w:t>
+            </w:r>
+            <w:r>
+              <w:rPr>
+                <w:sz w:val="20"/>
+                <w:szCs w:val="20"/>
+              </w:rPr>
+              <w:t>p</w:t>
+            </w:r>
+            <w:r>
+              <w:rPr>
+                <w:sz w:val="20"/>
+                <w:szCs w:val="20"/>
+              </w:rPr>
+              <w:t>roceso}}</w:t>
             </w:r>
           </w:p>
         </w:tc>
@@ -1024,20 +1076,31 @@
           </w:tcPr>
           <w:p>
             <w:pPr>
-              <w:spacing w:line="240" w:lineRule="auto"/>
-              <w:ind w:left="360"/>
-              <w:jc w:val="both"/>
-              <w:rPr>
-                <w:sz w:val="20"/>
-                <w:szCs w:val="20"/>
-              </w:rPr>
-            </w:pPr>
-            <w:r>
-              <w:rPr>
-                <w:sz w:val="20"/>
-                <w:szCs w:val="20"/>
-              </w:rPr>
-              <w:t>{{Producto}}</w:t>
+              <w:rPr>
+                <w:sz w:val="20"/>
+                <w:szCs w:val="20"/>
+              </w:rPr>
+            </w:pPr>
+            <w:r>
+              <w:rPr>
+                <w:sz w:val="20"/>
+                <w:szCs w:val="20"/>
+              </w:rPr>
+              <w:t>{{</w:t>
+            </w:r>
+            <w:r>
+              <w:rPr>
+                <w:sz w:val="20"/>
+                <w:szCs w:val="20"/>
+              </w:rPr>
+              <w:t>salidas</w:t>
+            </w:r>
+            <w:r>
+              <w:rPr>
+                <w:sz w:val="20"/>
+                <w:szCs w:val="20"/>
+              </w:rPr>
+              <w:t>}}</w:t>
             </w:r>
           </w:p>
         </w:tc>
@@ -1047,9 +1110,6 @@
           </w:tcPr>
           <w:p>
             <w:pPr>
-              <w:spacing w:line="240" w:lineRule="auto"/>
-              <w:ind w:left="360"/>
-              <w:jc w:val="both"/>
               <w:rPr>
                 <w:sz w:val="20"/>
                 <w:szCs w:val="20"/>
@@ -1062,15 +1122,13 @@
               </w:rPr>
               <w:t>{{</w:t>
             </w:r>
-            <w:proofErr w:type="spellStart"/>
-            <w:r>
-              <w:rPr>
-                <w:sz w:val="20"/>
-                <w:szCs w:val="20"/>
-              </w:rPr>
-              <w:t>Receptor_del_producto</w:t>
-            </w:r>
-            <w:proofErr w:type="spellEnd"/>
+            <w:r>
+              <w:rPr>
+                <w:sz w:val="20"/>
+                <w:szCs w:val="20"/>
+              </w:rPr>
+              <w:t>cliente</w:t>
+            </w:r>
             <w:r>
               <w:rPr>
                 <w:sz w:val="20"/>
@@ -1125,24 +1183,30 @@
             <w:pPr>
               <w:spacing w:line="240" w:lineRule="auto"/>
               <w:rPr>
-                <w:b/>
-                <w:bCs/>
-                <w:i/>
-                <w:iCs/>
-                <w:sz w:val="20"/>
-                <w:szCs w:val="20"/>
-              </w:rPr>
-            </w:pPr>
-            <w:r>
-              <w:rPr>
-                <w:b/>
-                <w:bCs/>
-                <w:i/>
-                <w:iCs/>
-                <w:sz w:val="20"/>
-                <w:szCs w:val="20"/>
-              </w:rPr>
-              <w:t xml:space="preserve">   {{Riesgos}}</w:t>
+                <w:sz w:val="20"/>
+                <w:szCs w:val="20"/>
+              </w:rPr>
+            </w:pPr>
+            <w:r>
+              <w:rPr>
+                <w:sz w:val="20"/>
+                <w:szCs w:val="20"/>
+              </w:rPr>
+              <w:t xml:space="preserve">   {{</w:t>
+            </w:r>
+            <w:r>
+              <w:rPr>
+                <w:sz w:val="20"/>
+                <w:szCs w:val="20"/>
+              </w:rPr>
+              <w:t>r</w:t>
+            </w:r>
+            <w:r>
+              <w:rPr>
+                <w:sz w:val="20"/>
+                <w:szCs w:val="20"/>
+              </w:rPr>
+              <w:t>iesgos}}</w:t>
             </w:r>
           </w:p>
         </w:tc>
@@ -1190,24 +1254,30 @@
             <w:pPr>
               <w:spacing w:line="240" w:lineRule="auto"/>
               <w:rPr>
-                <w:b/>
-                <w:bCs/>
-                <w:i/>
-                <w:iCs/>
-                <w:sz w:val="20"/>
-                <w:szCs w:val="20"/>
-              </w:rPr>
-            </w:pPr>
-            <w:r>
-              <w:rPr>
-                <w:b/>
-                <w:bCs/>
-                <w:i/>
-                <w:iCs/>
-                <w:sz w:val="20"/>
-                <w:szCs w:val="20"/>
-              </w:rPr>
-              <w:t xml:space="preserve">   {{Registros}}</w:t>
+                <w:sz w:val="20"/>
+                <w:szCs w:val="20"/>
+              </w:rPr>
+            </w:pPr>
+            <w:r>
+              <w:rPr>
+                <w:sz w:val="20"/>
+                <w:szCs w:val="20"/>
+              </w:rPr>
+              <w:t xml:space="preserve">   {{</w:t>
+            </w:r>
+            <w:r>
+              <w:rPr>
+                <w:sz w:val="20"/>
+                <w:szCs w:val="20"/>
+              </w:rPr>
+              <w:t>r</w:t>
+            </w:r>
+            <w:r>
+              <w:rPr>
+                <w:sz w:val="20"/>
+                <w:szCs w:val="20"/>
+              </w:rPr>
+              <w:t>egistros}}</w:t>
             </w:r>
           </w:p>
         </w:tc>
@@ -1261,47 +1331,30 @@
             <w:pPr>
               <w:spacing w:line="240" w:lineRule="auto"/>
               <w:rPr>
-                <w:i/>
-                <w:iCs/>
-                <w:sz w:val="20"/>
-                <w:szCs w:val="20"/>
-              </w:rPr>
-            </w:pPr>
-            <w:r>
-              <w:rPr>
-                <w:sz w:val="20"/>
-                <w:szCs w:val="20"/>
-              </w:rPr>
-              <w:t xml:space="preserve"> </w:t>
-            </w:r>
-            <w:r>
-              <w:rPr>
-                <w:i/>
-                <w:iCs/>
-                <w:sz w:val="20"/>
-                <w:szCs w:val="20"/>
-              </w:rPr>
-              <w:t xml:space="preserve">  {{</w:t>
-            </w:r>
-            <w:proofErr w:type="spellStart"/>
-            <w:r>
-              <w:rPr>
-                <w:i/>
-                <w:iCs/>
-                <w:sz w:val="20"/>
-                <w:szCs w:val="20"/>
-              </w:rPr>
-              <w:t>Actividades_del_proceso</w:t>
-            </w:r>
-            <w:proofErr w:type="spellEnd"/>
-            <w:r>
-              <w:rPr>
-                <w:i/>
-                <w:iCs/>
-                <w:sz w:val="20"/>
-                <w:szCs w:val="20"/>
-              </w:rPr>
-              <w:t>}}</w:t>
+                <w:sz w:val="20"/>
+                <w:szCs w:val="20"/>
+              </w:rPr>
+            </w:pPr>
+            <w:r>
+              <w:rPr>
+                <w:sz w:val="20"/>
+                <w:szCs w:val="20"/>
+              </w:rPr>
+              <w:t xml:space="preserve">   {{</w:t>
+            </w:r>
+            <w:r>
+              <w:rPr>
+                <w:sz w:val="20"/>
+                <w:szCs w:val="20"/>
+              </w:rPr>
+              <w:t>a</w:t>
+            </w:r>
+            <w:r>
+              <w:rPr>
+                <w:sz w:val="20"/>
+                <w:szCs w:val="20"/>
+              </w:rPr>
+              <w:t>ctividades}}</w:t>
             </w:r>
           </w:p>
         </w:tc>

</xml_diff>

<commit_message>
feat: add scripts to extract document placeholders from Word templates via PowerShell and Node.js
</commit_message>
<xml_diff>
--- a/plantilla/Generación de FPP 1 - 4_  Plantilla valores.docx
+++ b/plantilla/Generación de FPP 1 - 4_  Plantilla valores.docx
@@ -200,6 +200,7 @@
               </w:rPr>
               <w:t>{{</w:t>
             </w:r>
+            <w:proofErr w:type="spellStart"/>
             <w:r>
               <w:rPr>
                 <w:sz w:val="20"/>
@@ -212,7 +213,15 @@
                 <w:sz w:val="20"/>
                 <w:szCs w:val="20"/>
               </w:rPr>
-              <w:t>odigo}}</w:t>
+              <w:t>odigo</w:t>
+            </w:r>
+            <w:proofErr w:type="spellEnd"/>
+            <w:r>
+              <w:rPr>
+                <w:sz w:val="20"/>
+                <w:szCs w:val="20"/>
+              </w:rPr>
+              <w:t>}}</w:t>
             </w:r>
           </w:p>
         </w:tc>
@@ -256,6 +265,7 @@
               </w:rPr>
               <w:t>{{</w:t>
             </w:r>
+            <w:proofErr w:type="spellStart"/>
             <w:r>
               <w:rPr>
                 <w:sz w:val="20"/>
@@ -268,7 +278,15 @@
                 <w:sz w:val="20"/>
                 <w:szCs w:val="20"/>
               </w:rPr>
-              <w:t>ersion}}</w:t>
+              <w:t>ersion</w:t>
+            </w:r>
+            <w:proofErr w:type="spellEnd"/>
+            <w:r>
+              <w:rPr>
+                <w:sz w:val="20"/>
+                <w:szCs w:val="20"/>
+              </w:rPr>
+              <w:t>}}</w:t>
             </w:r>
           </w:p>
         </w:tc>
@@ -332,6 +350,7 @@
               </w:rPr>
               <w:t>{{</w:t>
             </w:r>
+            <w:proofErr w:type="spellStart"/>
             <w:r>
               <w:rPr>
                 <w:sz w:val="20"/>
@@ -339,6 +358,7 @@
               </w:rPr>
               <w:t>tipoProceso</w:t>
             </w:r>
+            <w:proofErr w:type="spellEnd"/>
             <w:r>
               <w:rPr>
                 <w:sz w:val="20"/>
@@ -477,6 +497,7 @@
               </w:rPr>
               <w:t>{{</w:t>
             </w:r>
+            <w:proofErr w:type="spellStart"/>
             <w:r>
               <w:rPr>
                 <w:sz w:val="20"/>
@@ -503,7 +524,15 @@
                 <w:sz w:val="20"/>
                 <w:szCs w:val="20"/>
               </w:rPr>
-              <w:t>roceso}}</w:t>
+              <w:t>roceso</w:t>
+            </w:r>
+            <w:proofErr w:type="spellEnd"/>
+            <w:r>
+              <w:rPr>
+                <w:sz w:val="20"/>
+                <w:szCs w:val="20"/>
+              </w:rPr>
+              <w:t>}}</w:t>
             </w:r>
           </w:p>
         </w:tc>
@@ -567,6 +596,7 @@
               </w:rPr>
               <w:t>{{</w:t>
             </w:r>
+            <w:proofErr w:type="spellStart"/>
             <w:r>
               <w:rPr>
                 <w:sz w:val="20"/>
@@ -593,7 +623,15 @@
                 <w:sz w:val="20"/>
                 <w:szCs w:val="20"/>
               </w:rPr>
-              <w:t>roceso}}</w:t>
+              <w:t>roceso</w:t>
+            </w:r>
+            <w:proofErr w:type="spellEnd"/>
+            <w:r>
+              <w:rPr>
+                <w:sz w:val="20"/>
+                <w:szCs w:val="20"/>
+              </w:rPr>
+              <w:t>}}</w:t>
             </w:r>
           </w:p>
         </w:tc>
@@ -652,6 +690,7 @@
               </w:rPr>
               <w:t>{{</w:t>
             </w:r>
+            <w:proofErr w:type="spellStart"/>
             <w:r>
               <w:rPr>
                 <w:sz w:val="20"/>
@@ -692,7 +731,15 @@
                 <w:sz w:val="20"/>
                 <w:szCs w:val="20"/>
               </w:rPr>
-              <w:t>gico}}</w:t>
+              <w:t>gico</w:t>
+            </w:r>
+            <w:proofErr w:type="spellEnd"/>
+            <w:r>
+              <w:rPr>
+                <w:sz w:val="20"/>
+                <w:szCs w:val="20"/>
+              </w:rPr>
+              <w:t>}}</w:t>
             </w:r>
           </w:p>
         </w:tc>
@@ -750,6 +797,7 @@
               </w:rPr>
               <w:t>{{</w:t>
             </w:r>
+            <w:proofErr w:type="spellStart"/>
             <w:r>
               <w:rPr>
                 <w:sz w:val="20"/>
@@ -757,6 +805,7 @@
               </w:rPr>
               <w:t>requisitosNormativos</w:t>
             </w:r>
+            <w:proofErr w:type="spellEnd"/>
             <w:r>
               <w:rPr>
                 <w:sz w:val="20"/>
@@ -1062,7 +1111,21 @@
                 <w:sz w:val="20"/>
                 <w:szCs w:val="20"/>
               </w:rPr>
-              <w:t>roceso}}</w:t>
+              <w:t>roceso</w:t>
+            </w:r>
+            <w:r>
+              <w:rPr>
+                <w:sz w:val="20"/>
+                <w:szCs w:val="20"/>
+              </w:rPr>
+              <w:t>s</w:t>
+            </w:r>
+            <w:r>
+              <w:rPr>
+                <w:sz w:val="20"/>
+                <w:szCs w:val="20"/>
+              </w:rPr>
+              <w:t>}}</w:t>
             </w:r>
           </w:p>
         </w:tc>

</xml_diff>